<commit_message>
Format the guide's Word file like the report (fonts, table borders, page numbers)
Co-Authored-By: Claude Sonnet 5.5 <noreply@anthropic.com>
Claude-Session: https://claude.ai/code/session_01LvCGrqg7ksGdqkTGa1S17L
</commit_message>
<xml_diff>
--- a/report/Screenshots_and_Finalization_Guide.docx
+++ b/report/Screenshots_and_Finalization_Guide.docx
@@ -5,6 +5,7 @@
     <w:p>
       <w:pPr>
         <w:pStyle w:val="Title"/>
+        <w:jc w:val="center"/>
       </w:pPr>
       <w:r>
         <w:t xml:space="preserve">LexFront</w:t>
@@ -55,6 +56,7 @@
     <w:p>
       <w:pPr>
         <w:pStyle w:val="Subtitle"/>
+        <w:jc w:val="center"/>
       </w:pPr>
       <w:r>
         <w:t xml:space="preserve">What</w:t>
@@ -758,8 +760,16 @@
       <w:tblPr>
         <w:tblStyle w:val="Table"/>
         <w:tblW w:type="pct" w:w="5000"/>
+        <w:jc w:val="center"/>
         <w:tblLook w:firstRow="1" w:lastRow="0" w:firstColumn="0" w:lastColumn="0" w:noHBand="0" w:noVBand="0" w:val="0020"/>
-        <w:jc w:val="start"/>
+        <w:tblBorders>
+          <w:top w:val="single" w:sz="4" w:space="0" w:color="808080"/>
+          <w:left w:val="single" w:sz="4" w:space="0" w:color="808080"/>
+          <w:bottom w:val="single" w:sz="4" w:space="0" w:color="808080"/>
+          <w:right w:val="single" w:sz="4" w:space="0" w:color="808080"/>
+          <w:insideH w:val="single" w:sz="4" w:space="0" w:color="808080"/>
+          <w:insideV w:val="single" w:sz="4" w:space="0" w:color="808080"/>
+        </w:tblBorders>
       </w:tblPr>
       <w:tblGrid>
         <w:gridCol w:w="576"/>
@@ -769,53 +779,83 @@
       <w:tr>
         <w:trPr>
           <w:tblHeader w:val="true"/>
+          <w:cantSplit/>
+          <w:tblHeader/>
         </w:trPr>
         <w:tc>
-          <w:tcPr/>
-          <w:p>
-            <w:pPr>
-              <w:pStyle w:val="Compact"/>
-              <w:jc w:val="left"/>
-            </w:pPr>
-            <w:r>
+          <w:tcPr>
+            <w:shd w:val="clear" w:color="auto" w:fill="E7E6E6"/>
+          </w:tcPr>
+          <w:p>
+            <w:pPr>
+              <w:pStyle w:val="Compact"/>
+              <w:spacing w:after="20" w:before="20"/>
+              <w:jc w:val="left"/>
+            </w:pPr>
+            <w:r>
+              <w:rPr>
+                <w:b/>
+                <w:sz w:val="16"/>
+              </w:rPr>
               <w:t xml:space="preserve">ID</w:t>
             </w:r>
           </w:p>
         </w:tc>
         <w:tc>
-          <w:tcPr/>
-          <w:p>
-            <w:pPr>
-              <w:pStyle w:val="Compact"/>
-              <w:jc w:val="left"/>
-            </w:pPr>
-            <w:r>
+          <w:tcPr>
+            <w:shd w:val="clear" w:color="auto" w:fill="E7E6E6"/>
+          </w:tcPr>
+          <w:p>
+            <w:pPr>
+              <w:pStyle w:val="Compact"/>
+              <w:spacing w:after="20" w:before="20"/>
+              <w:jc w:val="left"/>
+            </w:pPr>
+            <w:r>
+              <w:rPr>
+                <w:b/>
+                <w:sz w:val="16"/>
+              </w:rPr>
               <w:t xml:space="preserve">What to capture</w:t>
             </w:r>
           </w:p>
         </w:tc>
         <w:tc>
-          <w:tcPr/>
-          <w:p>
-            <w:pPr>
-              <w:pStyle w:val="Compact"/>
-              <w:jc w:val="left"/>
-            </w:pPr>
-            <w:r>
+          <w:tcPr>
+            <w:shd w:val="clear" w:color="auto" w:fill="E7E6E6"/>
+          </w:tcPr>
+          <w:p>
+            <w:pPr>
+              <w:pStyle w:val="Compact"/>
+              <w:spacing w:after="20" w:before="20"/>
+              <w:jc w:val="left"/>
+            </w:pPr>
+            <w:r>
+              <w:rPr>
+                <w:b/>
+                <w:sz w:val="16"/>
+              </w:rPr>
               <w:t xml:space="preserve">Where it goes</w:t>
             </w:r>
           </w:p>
         </w:tc>
       </w:tr>
       <w:tr>
+        <w:trPr>
+          <w:cantSplit/>
+        </w:trPr>
         <w:tc>
           <w:tcPr/>
           <w:p>
             <w:pPr>
               <w:pStyle w:val="Compact"/>
-              <w:jc w:val="left"/>
-            </w:pPr>
-            <w:r>
+              <w:spacing w:after="20" w:before="20"/>
+              <w:jc w:val="left"/>
+            </w:pPr>
+            <w:r>
+              <w:rPr>
+                <w:sz w:val="16"/>
+              </w:rPr>
               <w:t xml:space="preserve">S1</w:t>
             </w:r>
           </w:p>
@@ -825,9 +865,13 @@
           <w:p>
             <w:pPr>
               <w:pStyle w:val="Compact"/>
-              <w:jc w:val="left"/>
-            </w:pPr>
-            <w:r>
+              <w:spacing w:after="20" w:before="20"/>
+              <w:jc w:val="left"/>
+            </w:pPr>
+            <w:r>
+              <w:rPr>
+                <w:sz w:val="16"/>
+              </w:rPr>
               <w:t xml:space="preserve">Repository file tree</w:t>
             </w:r>
           </w:p>
@@ -837,23 +881,34 @@
           <w:p>
             <w:pPr>
               <w:pStyle w:val="Compact"/>
-              <w:jc w:val="left"/>
-            </w:pPr>
-            <w:r>
+              <w:spacing w:after="20" w:before="20"/>
+              <w:jc w:val="left"/>
+            </w:pPr>
+            <w:r>
+              <w:rPr>
+                <w:sz w:val="16"/>
+              </w:rPr>
               <w:t xml:space="preserve">Section 3 or Appendix</w:t>
             </w:r>
           </w:p>
         </w:tc>
       </w:tr>
       <w:tr>
+        <w:trPr>
+          <w:cantSplit/>
+        </w:trPr>
         <w:tc>
           <w:tcPr/>
           <w:p>
             <w:pPr>
               <w:pStyle w:val="Compact"/>
-              <w:jc w:val="left"/>
-            </w:pPr>
-            <w:r>
+              <w:spacing w:after="20" w:before="20"/>
+              <w:jc w:val="left"/>
+            </w:pPr>
+            <w:r>
+              <w:rPr>
+                <w:sz w:val="16"/>
+              </w:rPr>
               <w:t xml:space="preserve">S2</w:t>
             </w:r>
           </w:p>
@@ -863,18 +918,26 @@
           <w:p>
             <w:pPr>
               <w:pStyle w:val="Compact"/>
+              <w:spacing w:after="20" w:before="20"/>
               <w:jc w:val="left"/>
             </w:pPr>
             <w:r>
               <w:rPr>
                 <w:rStyle w:val="VerbatimChar"/>
+                <w:sz w:val="16"/>
               </w:rPr>
               <w:t xml:space="preserve">pytest -q</w:t>
             </w:r>
             <w:r>
+              <w:rPr>
+                <w:sz w:val="16"/>
+              </w:rPr>
               <w:t xml:space="preserve"> </w:t>
             </w:r>
             <w:r>
+              <w:rPr>
+                <w:sz w:val="16"/>
+              </w:rPr>
               <w:t xml:space="preserve">passing</w:t>
             </w:r>
           </w:p>
@@ -884,23 +947,34 @@
           <w:p>
             <w:pPr>
               <w:pStyle w:val="Compact"/>
-              <w:jc w:val="left"/>
-            </w:pPr>
-            <w:r>
+              <w:spacing w:after="20" w:before="20"/>
+              <w:jc w:val="left"/>
+            </w:pPr>
+            <w:r>
+              <w:rPr>
+                <w:sz w:val="16"/>
+              </w:rPr>
               <w:t xml:space="preserve">Section 3.2 or Appendix</w:t>
             </w:r>
           </w:p>
         </w:tc>
       </w:tr>
       <w:tr>
+        <w:trPr>
+          <w:cantSplit/>
+        </w:trPr>
         <w:tc>
           <w:tcPr/>
           <w:p>
             <w:pPr>
               <w:pStyle w:val="Compact"/>
-              <w:jc w:val="left"/>
-            </w:pPr>
-            <w:r>
+              <w:spacing w:after="20" w:before="20"/>
+              <w:jc w:val="left"/>
+            </w:pPr>
+            <w:r>
+              <w:rPr>
+                <w:sz w:val="16"/>
+              </w:rPr>
               <w:t xml:space="preserve">S3</w:t>
             </w:r>
           </w:p>
@@ -910,9 +984,13 @@
           <w:p>
             <w:pPr>
               <w:pStyle w:val="Compact"/>
-              <w:jc w:val="left"/>
-            </w:pPr>
-            <w:r>
+              <w:spacing w:after="20" w:before="20"/>
+              <w:jc w:val="left"/>
+            </w:pPr>
+            <w:r>
+              <w:rPr>
+                <w:sz w:val="16"/>
+              </w:rPr>
               <w:t xml:space="preserve">GitHub Actions run, green</w:t>
             </w:r>
           </w:p>
@@ -922,23 +1000,34 @@
           <w:p>
             <w:pPr>
               <w:pStyle w:val="Compact"/>
-              <w:jc w:val="left"/>
-            </w:pPr>
-            <w:r>
+              <w:spacing w:after="20" w:before="20"/>
+              <w:jc w:val="left"/>
+            </w:pPr>
+            <w:r>
+              <w:rPr>
+                <w:sz w:val="16"/>
+              </w:rPr>
               <w:t xml:space="preserve">Appendix</w:t>
             </w:r>
           </w:p>
         </w:tc>
       </w:tr>
       <w:tr>
+        <w:trPr>
+          <w:cantSplit/>
+        </w:trPr>
         <w:tc>
           <w:tcPr/>
           <w:p>
             <w:pPr>
               <w:pStyle w:val="Compact"/>
-              <w:jc w:val="left"/>
-            </w:pPr>
-            <w:r>
+              <w:spacing w:after="20" w:before="20"/>
+              <w:jc w:val="left"/>
+            </w:pPr>
+            <w:r>
+              <w:rPr>
+                <w:sz w:val="16"/>
+              </w:rPr>
               <w:t xml:space="preserve">S4</w:t>
             </w:r>
           </w:p>
@@ -948,9 +1037,13 @@
           <w:p>
             <w:pPr>
               <w:pStyle w:val="Compact"/>
-              <w:jc w:val="left"/>
-            </w:pPr>
-            <w:r>
+              <w:spacing w:after="20" w:before="20"/>
+              <w:jc w:val="left"/>
+            </w:pPr>
+            <w:r>
+              <w:rPr>
+                <w:sz w:val="16"/>
+              </w:rPr>
               <w:t xml:space="preserve">Console output of a Module 1 run</w:t>
             </w:r>
           </w:p>
@@ -960,23 +1053,34 @@
           <w:p>
             <w:pPr>
               <w:pStyle w:val="Compact"/>
-              <w:jc w:val="left"/>
-            </w:pPr>
-            <w:r>
+              <w:spacing w:after="20" w:before="20"/>
+              <w:jc w:val="left"/>
+            </w:pPr>
+            <w:r>
+              <w:rPr>
+                <w:sz w:val="16"/>
+              </w:rPr>
               <w:t xml:space="preserve">Section 4.2 or Appendix</w:t>
             </w:r>
           </w:p>
         </w:tc>
       </w:tr>
       <w:tr>
+        <w:trPr>
+          <w:cantSplit/>
+        </w:trPr>
         <w:tc>
           <w:tcPr/>
           <w:p>
             <w:pPr>
               <w:pStyle w:val="Compact"/>
-              <w:jc w:val="left"/>
-            </w:pPr>
-            <w:r>
+              <w:spacing w:after="20" w:before="20"/>
+              <w:jc w:val="left"/>
+            </w:pPr>
+            <w:r>
+              <w:rPr>
+                <w:sz w:val="16"/>
+              </w:rPr>
               <w:t xml:space="preserve">S5</w:t>
             </w:r>
           </w:p>
@@ -986,9 +1090,13 @@
           <w:p>
             <w:pPr>
               <w:pStyle w:val="Compact"/>
-              <w:jc w:val="left"/>
-            </w:pPr>
-            <w:r>
+              <w:spacing w:after="20" w:before="20"/>
+              <w:jc w:val="left"/>
+            </w:pPr>
+            <w:r>
+              <w:rPr>
+                <w:sz w:val="16"/>
+              </w:rPr>
               <w:t xml:space="preserve">One result JSON file opened</w:t>
             </w:r>
           </w:p>
@@ -998,23 +1106,34 @@
           <w:p>
             <w:pPr>
               <w:pStyle w:val="Compact"/>
-              <w:jc w:val="left"/>
-            </w:pPr>
-            <w:r>
+              <w:spacing w:after="20" w:before="20"/>
+              <w:jc w:val="left"/>
+            </w:pPr>
+            <w:r>
+              <w:rPr>
+                <w:sz w:val="16"/>
+              </w:rPr>
               <w:t xml:space="preserve">Section 3.1 or Appendix</w:t>
             </w:r>
           </w:p>
         </w:tc>
       </w:tr>
       <w:tr>
+        <w:trPr>
+          <w:cantSplit/>
+        </w:trPr>
         <w:tc>
           <w:tcPr/>
           <w:p>
             <w:pPr>
               <w:pStyle w:val="Compact"/>
-              <w:jc w:val="left"/>
-            </w:pPr>
-            <w:r>
+              <w:spacing w:after="20" w:before="20"/>
+              <w:jc w:val="left"/>
+            </w:pPr>
+            <w:r>
+              <w:rPr>
+                <w:sz w:val="16"/>
+              </w:rPr>
               <w:t xml:space="preserve">S6</w:t>
             </w:r>
           </w:p>
@@ -1024,9 +1143,13 @@
           <w:p>
             <w:pPr>
               <w:pStyle w:val="Compact"/>
-              <w:jc w:val="left"/>
-            </w:pPr>
-            <w:r>
+              <w:spacing w:after="20" w:before="20"/>
+              <w:jc w:val="left"/>
+            </w:pPr>
+            <w:r>
+              <w:rPr>
+                <w:sz w:val="16"/>
+              </w:rPr>
               <w:t xml:space="preserve">Notebook: datasets table</w:t>
             </w:r>
           </w:p>
@@ -1036,23 +1159,34 @@
           <w:p>
             <w:pPr>
               <w:pStyle w:val="Compact"/>
-              <w:jc w:val="left"/>
-            </w:pPr>
-            <w:r>
+              <w:spacing w:after="20" w:before="20"/>
+              <w:jc w:val="left"/>
+            </w:pPr>
+            <w:r>
+              <w:rPr>
+                <w:sz w:val="16"/>
+              </w:rPr>
               <w:t xml:space="preserve">Section 4.1</w:t>
             </w:r>
           </w:p>
         </w:tc>
       </w:tr>
       <w:tr>
+        <w:trPr>
+          <w:cantSplit/>
+        </w:trPr>
         <w:tc>
           <w:tcPr/>
           <w:p>
             <w:pPr>
               <w:pStyle w:val="Compact"/>
-              <w:jc w:val="left"/>
-            </w:pPr>
-            <w:r>
+              <w:spacing w:after="20" w:before="20"/>
+              <w:jc w:val="left"/>
+            </w:pPr>
+            <w:r>
+              <w:rPr>
+                <w:sz w:val="16"/>
+              </w:rPr>
               <w:t xml:space="preserve">S7</w:t>
             </w:r>
           </w:p>
@@ -1062,9 +1196,13 @@
           <w:p>
             <w:pPr>
               <w:pStyle w:val="Compact"/>
-              <w:jc w:val="left"/>
-            </w:pPr>
-            <w:r>
+              <w:spacing w:after="20" w:before="20"/>
+              <w:jc w:val="left"/>
+            </w:pPr>
+            <w:r>
+              <w:rPr>
+                <w:sz w:val="16"/>
+              </w:rPr>
               <w:t xml:space="preserve">Notebook: Module 1 table and bar chart</w:t>
             </w:r>
           </w:p>
@@ -1074,23 +1212,34 @@
           <w:p>
             <w:pPr>
               <w:pStyle w:val="Compact"/>
-              <w:jc w:val="left"/>
-            </w:pPr>
-            <w:r>
+              <w:spacing w:after="20" w:before="20"/>
+              <w:jc w:val="left"/>
+            </w:pPr>
+            <w:r>
+              <w:rPr>
+                <w:sz w:val="16"/>
+              </w:rPr>
               <w:t xml:space="preserve">Section 4.2</w:t>
             </w:r>
           </w:p>
         </w:tc>
       </w:tr>
       <w:tr>
+        <w:trPr>
+          <w:cantSplit/>
+        </w:trPr>
         <w:tc>
           <w:tcPr/>
           <w:p>
             <w:pPr>
               <w:pStyle w:val="Compact"/>
-              <w:jc w:val="left"/>
-            </w:pPr>
-            <w:r>
+              <w:spacing w:after="20" w:before="20"/>
+              <w:jc w:val="left"/>
+            </w:pPr>
+            <w:r>
+              <w:rPr>
+                <w:sz w:val="16"/>
+              </w:rPr>
               <w:t xml:space="preserve">S8</w:t>
             </w:r>
           </w:p>
@@ -1100,9 +1249,13 @@
           <w:p>
             <w:pPr>
               <w:pStyle w:val="Compact"/>
-              <w:jc w:val="left"/>
-            </w:pPr>
-            <w:r>
+              <w:spacing w:after="20" w:before="20"/>
+              <w:jc w:val="left"/>
+            </w:pPr>
+            <w:r>
+              <w:rPr>
+                <w:sz w:val="16"/>
+              </w:rPr>
               <w:t xml:space="preserve">Notebook: side-by-side tokenizer table</w:t>
             </w:r>
           </w:p>
@@ -1112,23 +1265,34 @@
           <w:p>
             <w:pPr>
               <w:pStyle w:val="Compact"/>
-              <w:jc w:val="left"/>
-            </w:pPr>
-            <w:r>
+              <w:spacing w:after="20" w:before="20"/>
+              <w:jc w:val="left"/>
+            </w:pPr>
+            <w:r>
+              <w:rPr>
+                <w:sz w:val="16"/>
+              </w:rPr>
               <w:t xml:space="preserve">Section 4.3</w:t>
             </w:r>
           </w:p>
         </w:tc>
       </w:tr>
       <w:tr>
+        <w:trPr>
+          <w:cantSplit/>
+        </w:trPr>
         <w:tc>
           <w:tcPr/>
           <w:p>
             <w:pPr>
               <w:pStyle w:val="Compact"/>
-              <w:jc w:val="left"/>
-            </w:pPr>
-            <w:r>
+              <w:spacing w:after="20" w:before="20"/>
+              <w:jc w:val="left"/>
+            </w:pPr>
+            <w:r>
+              <w:rPr>
+                <w:sz w:val="16"/>
+              </w:rPr>
               <w:t xml:space="preserve">S9</w:t>
             </w:r>
           </w:p>
@@ -1138,9 +1302,13 @@
           <w:p>
             <w:pPr>
               <w:pStyle w:val="Compact"/>
-              <w:jc w:val="left"/>
-            </w:pPr>
-            <w:r>
+              <w:spacing w:after="20" w:before="20"/>
+              <w:jc w:val="left"/>
+            </w:pPr>
+            <w:r>
+              <w:rPr>
+                <w:sz w:val="16"/>
+              </w:rPr>
               <w:t xml:space="preserve">Notebook: LexFront token table for one tweet, and symbol table</w:t>
             </w:r>
           </w:p>
@@ -1150,23 +1318,34 @@
           <w:p>
             <w:pPr>
               <w:pStyle w:val="Compact"/>
-              <w:jc w:val="left"/>
-            </w:pPr>
-            <w:r>
+              <w:spacing w:after="20" w:before="20"/>
+              <w:jc w:val="left"/>
+            </w:pPr>
+            <w:r>
+              <w:rPr>
+                <w:sz w:val="16"/>
+              </w:rPr>
               <w:t xml:space="preserve">Section 3.2 or 4.3</w:t>
             </w:r>
           </w:p>
         </w:tc>
       </w:tr>
       <w:tr>
+        <w:trPr>
+          <w:cantSplit/>
+        </w:trPr>
         <w:tc>
           <w:tcPr/>
           <w:p>
             <w:pPr>
               <w:pStyle w:val="Compact"/>
-              <w:jc w:val="left"/>
-            </w:pPr>
-            <w:r>
+              <w:spacing w:after="20" w:before="20"/>
+              <w:jc w:val="left"/>
+            </w:pPr>
+            <w:r>
+              <w:rPr>
+                <w:sz w:val="16"/>
+              </w:rPr>
               <w:t xml:space="preserve">S10</w:t>
             </w:r>
           </w:p>
@@ -1176,9 +1355,13 @@
           <w:p>
             <w:pPr>
               <w:pStyle w:val="Compact"/>
-              <w:jc w:val="left"/>
-            </w:pPr>
-            <w:r>
+              <w:spacing w:after="20" w:before="20"/>
+              <w:jc w:val="left"/>
+            </w:pPr>
+            <w:r>
+              <w:rPr>
+                <w:sz w:val="16"/>
+              </w:rPr>
               <w:t xml:space="preserve">Notebook: DFA state table and DFA picture</w:t>
             </w:r>
           </w:p>
@@ -1188,23 +1371,34 @@
           <w:p>
             <w:pPr>
               <w:pStyle w:val="Compact"/>
-              <w:jc w:val="left"/>
-            </w:pPr>
-            <w:r>
+              <w:spacing w:after="20" w:before="20"/>
+              <w:jc w:val="left"/>
+            </w:pPr>
+            <w:r>
+              <w:rPr>
+                <w:sz w:val="16"/>
+              </w:rPr>
               <w:t xml:space="preserve">Section 4.3</w:t>
             </w:r>
           </w:p>
         </w:tc>
       </w:tr>
       <w:tr>
+        <w:trPr>
+          <w:cantSplit/>
+        </w:trPr>
         <w:tc>
           <w:tcPr/>
           <w:p>
             <w:pPr>
               <w:pStyle w:val="Compact"/>
-              <w:jc w:val="left"/>
-            </w:pPr>
-            <w:r>
+              <w:spacing w:after="20" w:before="20"/>
+              <w:jc w:val="left"/>
+            </w:pPr>
+            <w:r>
+              <w:rPr>
+                <w:sz w:val="16"/>
+              </w:rPr>
               <w:t xml:space="preserve">S11</w:t>
             </w:r>
           </w:p>
@@ -1214,9 +1408,13 @@
           <w:p>
             <w:pPr>
               <w:pStyle w:val="Compact"/>
-              <w:jc w:val="left"/>
-            </w:pPr>
-            <w:r>
+              <w:spacing w:after="20" w:before="20"/>
+              <w:jc w:val="left"/>
+            </w:pPr>
+            <w:r>
+              <w:rPr>
+                <w:sz w:val="16"/>
+              </w:rPr>
               <w:t xml:space="preserve">Notebook: scanner demo with UNKNOWN and the agreement line</w:t>
             </w:r>
           </w:p>
@@ -1226,23 +1424,34 @@
           <w:p>
             <w:pPr>
               <w:pStyle w:val="Compact"/>
-              <w:jc w:val="left"/>
-            </w:pPr>
-            <w:r>
+              <w:spacing w:after="20" w:before="20"/>
+              <w:jc w:val="left"/>
+            </w:pPr>
+            <w:r>
+              <w:rPr>
+                <w:sz w:val="16"/>
+              </w:rPr>
               <w:t xml:space="preserve">Section 4.3</w:t>
             </w:r>
           </w:p>
         </w:tc>
       </w:tr>
       <w:tr>
+        <w:trPr>
+          <w:cantSplit/>
+        </w:trPr>
         <w:tc>
           <w:tcPr/>
           <w:p>
             <w:pPr>
               <w:pStyle w:val="Compact"/>
-              <w:jc w:val="left"/>
-            </w:pPr>
-            <w:r>
+              <w:spacing w:after="20" w:before="20"/>
+              <w:jc w:val="left"/>
+            </w:pPr>
+            <w:r>
+              <w:rPr>
+                <w:sz w:val="16"/>
+              </w:rPr>
               <w:t xml:space="preserve">S12</w:t>
             </w:r>
           </w:p>
@@ -1252,9 +1461,13 @@
           <w:p>
             <w:pPr>
               <w:pStyle w:val="Compact"/>
-              <w:jc w:val="left"/>
-            </w:pPr>
-            <w:r>
+              <w:spacing w:after="20" w:before="20"/>
+              <w:jc w:val="left"/>
+            </w:pPr>
+            <w:r>
+              <w:rPr>
+                <w:sz w:val="16"/>
+              </w:rPr>
               <w:t xml:space="preserve">Notebook: intrinsic metrics table and chart</w:t>
             </w:r>
           </w:p>
@@ -1264,23 +1477,34 @@
           <w:p>
             <w:pPr>
               <w:pStyle w:val="Compact"/>
-              <w:jc w:val="left"/>
-            </w:pPr>
-            <w:r>
+              <w:spacing w:after="20" w:before="20"/>
+              <w:jc w:val="left"/>
+            </w:pPr>
+            <w:r>
+              <w:rPr>
+                <w:sz w:val="16"/>
+              </w:rPr>
               <w:t xml:space="preserve">Section 4.3</w:t>
             </w:r>
           </w:p>
         </w:tc>
       </w:tr>
       <w:tr>
+        <w:trPr>
+          <w:cantSplit/>
+        </w:trPr>
         <w:tc>
           <w:tcPr/>
           <w:p>
             <w:pPr>
               <w:pStyle w:val="Compact"/>
-              <w:jc w:val="left"/>
-            </w:pPr>
-            <w:r>
+              <w:spacing w:after="20" w:before="20"/>
+              <w:jc w:val="left"/>
+            </w:pPr>
+            <w:r>
+              <w:rPr>
+                <w:sz w:val="16"/>
+              </w:rPr>
               <w:t xml:space="preserve">S13</w:t>
             </w:r>
           </w:p>
@@ -1290,9 +1514,13 @@
           <w:p>
             <w:pPr>
               <w:pStyle w:val="Compact"/>
-              <w:jc w:val="left"/>
-            </w:pPr>
-            <w:r>
+              <w:spacing w:after="20" w:before="20"/>
+              <w:jc w:val="left"/>
+            </w:pPr>
+            <w:r>
+              <w:rPr>
+                <w:sz w:val="16"/>
+              </w:rPr>
               <w:t xml:space="preserve">Notebook: existing vs proposed table and chart</w:t>
             </w:r>
           </w:p>
@@ -1302,23 +1530,34 @@
           <w:p>
             <w:pPr>
               <w:pStyle w:val="Compact"/>
-              <w:jc w:val="left"/>
-            </w:pPr>
-            <w:r>
+              <w:spacing w:after="20" w:before="20"/>
+              <w:jc w:val="left"/>
+            </w:pPr>
+            <w:r>
+              <w:rPr>
+                <w:sz w:val="16"/>
+              </w:rPr>
               <w:t xml:space="preserve">Section 5.1</w:t>
             </w:r>
           </w:p>
         </w:tc>
       </w:tr>
       <w:tr>
+        <w:trPr>
+          <w:cantSplit/>
+        </w:trPr>
         <w:tc>
           <w:tcPr/>
           <w:p>
             <w:pPr>
               <w:pStyle w:val="Compact"/>
-              <w:jc w:val="left"/>
-            </w:pPr>
-            <w:r>
+              <w:spacing w:after="20" w:before="20"/>
+              <w:jc w:val="left"/>
+            </w:pPr>
+            <w:r>
+              <w:rPr>
+                <w:sz w:val="16"/>
+              </w:rPr>
               <w:t xml:space="preserve">S14</w:t>
             </w:r>
           </w:p>
@@ -1328,17 +1567,25 @@
           <w:p>
             <w:pPr>
               <w:pStyle w:val="Compact"/>
-              <w:jc w:val="left"/>
-            </w:pPr>
-            <w:r>
+              <w:spacing w:after="20" w:before="20"/>
+              <w:jc w:val="left"/>
+            </w:pPr>
+            <w:r>
+              <w:rPr>
+                <w:sz w:val="16"/>
+              </w:rPr>
               <w:t xml:space="preserve">CHANGELOG and</w:t>
             </w:r>
             <w:r>
+              <w:rPr>
+                <w:sz w:val="16"/>
+              </w:rPr>
               <w:t xml:space="preserve"> </w:t>
             </w:r>
             <w:r>
               <w:rPr>
                 <w:rStyle w:val="VerbatimChar"/>
+                <w:sz w:val="16"/>
               </w:rPr>
               <w:t xml:space="preserve">git log</w:t>
             </w:r>
@@ -1349,15 +1596,24 @@
           <w:p>
             <w:pPr>
               <w:pStyle w:val="Compact"/>
-              <w:jc w:val="left"/>
-            </w:pPr>
-            <w:r>
+              <w:spacing w:after="20" w:before="20"/>
+              <w:jc w:val="left"/>
+            </w:pPr>
+            <w:r>
+              <w:rPr>
+                <w:sz w:val="16"/>
+              </w:rPr>
               <w:t xml:space="preserve">Appendix</w:t>
             </w:r>
           </w:p>
         </w:tc>
       </w:tr>
     </w:tbl>
+    <w:p>
+      <w:pPr>
+        <w:spacing w:before="0" w:after="60" w:line="120" w:lineRule="exact"/>
+      </w:pPr>
+    </w:p>
     <w:p>
       <w:pPr>
         <w:pStyle w:val="BodyText"/>
@@ -1929,8 +2185,16 @@
       <w:tblPr>
         <w:tblStyle w:val="Table"/>
         <w:tblW w:type="pct" w:w="5000"/>
+        <w:jc w:val="center"/>
         <w:tblLook w:firstRow="1" w:lastRow="0" w:firstColumn="0" w:lastColumn="0" w:noHBand="0" w:noVBand="0" w:val="0020"/>
-        <w:jc w:val="start"/>
+        <w:tblBorders>
+          <w:top w:val="single" w:sz="4" w:space="0" w:color="808080"/>
+          <w:left w:val="single" w:sz="4" w:space="0" w:color="808080"/>
+          <w:bottom w:val="single" w:sz="4" w:space="0" w:color="808080"/>
+          <w:right w:val="single" w:sz="4" w:space="0" w:color="808080"/>
+          <w:insideH w:val="single" w:sz="4" w:space="0" w:color="808080"/>
+          <w:insideV w:val="single" w:sz="4" w:space="0" w:color="808080"/>
+        </w:tblBorders>
       </w:tblPr>
       <w:tblGrid>
         <w:gridCol w:w="510"/>
@@ -1940,53 +2204,83 @@
       <w:tr>
         <w:trPr>
           <w:tblHeader w:val="true"/>
+          <w:cantSplit/>
+          <w:tblHeader/>
         </w:trPr>
         <w:tc>
-          <w:tcPr/>
-          <w:p>
-            <w:pPr>
-              <w:pStyle w:val="Compact"/>
-              <w:jc w:val="left"/>
-            </w:pPr>
-            <w:r>
+          <w:tcPr>
+            <w:shd w:val="clear" w:color="auto" w:fill="E7E6E6"/>
+          </w:tcPr>
+          <w:p>
+            <w:pPr>
+              <w:pStyle w:val="Compact"/>
+              <w:spacing w:after="20" w:before="20"/>
+              <w:jc w:val="left"/>
+            </w:pPr>
+            <w:r>
+              <w:rPr>
+                <w:b/>
+                <w:sz w:val="16"/>
+              </w:rPr>
               <w:t xml:space="preserve">ID</w:t>
             </w:r>
           </w:p>
         </w:tc>
         <w:tc>
-          <w:tcPr/>
-          <w:p>
-            <w:pPr>
-              <w:pStyle w:val="Compact"/>
-              <w:jc w:val="left"/>
-            </w:pPr>
-            <w:r>
+          <w:tcPr>
+            <w:shd w:val="clear" w:color="auto" w:fill="E7E6E6"/>
+          </w:tcPr>
+          <w:p>
+            <w:pPr>
+              <w:pStyle w:val="Compact"/>
+              <w:spacing w:after="20" w:before="20"/>
+              <w:jc w:val="left"/>
+            </w:pPr>
+            <w:r>
+              <w:rPr>
+                <w:b/>
+                <w:sz w:val="16"/>
+              </w:rPr>
               <w:t xml:space="preserve">Notebook section</w:t>
             </w:r>
           </w:p>
         </w:tc>
         <w:tc>
-          <w:tcPr/>
-          <w:p>
-            <w:pPr>
-              <w:pStyle w:val="Compact"/>
-              <w:jc w:val="left"/>
-            </w:pPr>
-            <w:r>
+          <w:tcPr>
+            <w:shd w:val="clear" w:color="auto" w:fill="E7E6E6"/>
+          </w:tcPr>
+          <w:p>
+            <w:pPr>
+              <w:pStyle w:val="Compact"/>
+              <w:spacing w:after="20" w:before="20"/>
+              <w:jc w:val="left"/>
+            </w:pPr>
+            <w:r>
+              <w:rPr>
+                <w:b/>
+                <w:sz w:val="16"/>
+              </w:rPr>
               <w:t xml:space="preserve">What to capture</w:t>
             </w:r>
           </w:p>
         </w:tc>
       </w:tr>
       <w:tr>
+        <w:trPr>
+          <w:cantSplit/>
+        </w:trPr>
         <w:tc>
           <w:tcPr/>
           <w:p>
             <w:pPr>
               <w:pStyle w:val="Compact"/>
-              <w:jc w:val="left"/>
-            </w:pPr>
-            <w:r>
+              <w:spacing w:after="20" w:before="20"/>
+              <w:jc w:val="left"/>
+            </w:pPr>
+            <w:r>
+              <w:rPr>
+                <w:sz w:val="16"/>
+              </w:rPr>
               <w:t xml:space="preserve">S6</w:t>
             </w:r>
           </w:p>
@@ -1996,9 +2290,13 @@
           <w:p>
             <w:pPr>
               <w:pStyle w:val="Compact"/>
-              <w:jc w:val="left"/>
-            </w:pPr>
-            <w:r>
+              <w:spacing w:after="20" w:before="20"/>
+              <w:jc w:val="left"/>
+            </w:pPr>
+            <w:r>
+              <w:rPr>
+                <w:sz w:val="16"/>
+              </w:rPr>
               <w:t xml:space="preserve">1. Datasets</w:t>
             </w:r>
           </w:p>
@@ -2008,23 +2306,34 @@
           <w:p>
             <w:pPr>
               <w:pStyle w:val="Compact"/>
-              <w:jc w:val="left"/>
-            </w:pPr>
-            <w:r>
+              <w:spacing w:after="20" w:before="20"/>
+              <w:jc w:val="left"/>
+            </w:pPr>
+            <w:r>
+              <w:rPr>
+                <w:sz w:val="16"/>
+              </w:rPr>
               <w:t xml:space="preserve">The datasets table</w:t>
             </w:r>
           </w:p>
         </w:tc>
       </w:tr>
       <w:tr>
+        <w:trPr>
+          <w:cantSplit/>
+        </w:trPr>
         <w:tc>
           <w:tcPr/>
           <w:p>
             <w:pPr>
               <w:pStyle w:val="Compact"/>
-              <w:jc w:val="left"/>
-            </w:pPr>
-            <w:r>
+              <w:spacing w:after="20" w:before="20"/>
+              <w:jc w:val="left"/>
+            </w:pPr>
+            <w:r>
+              <w:rPr>
+                <w:sz w:val="16"/>
+              </w:rPr>
               <w:t xml:space="preserve">S7</w:t>
             </w:r>
           </w:p>
@@ -2034,9 +2343,13 @@
           <w:p>
             <w:pPr>
               <w:pStyle w:val="Compact"/>
-              <w:jc w:val="left"/>
-            </w:pPr>
-            <w:r>
+              <w:spacing w:after="20" w:before="20"/>
+              <w:jc w:val="left"/>
+            </w:pPr>
+            <w:r>
+              <w:rPr>
+                <w:sz w:val="16"/>
+              </w:rPr>
               <w:t xml:space="preserve">2. Module 1</w:t>
             </w:r>
           </w:p>
@@ -2046,23 +2359,34 @@
           <w:p>
             <w:pPr>
               <w:pStyle w:val="Compact"/>
-              <w:jc w:val="left"/>
-            </w:pPr>
-            <w:r>
+              <w:spacing w:after="20" w:before="20"/>
+              <w:jc w:val="left"/>
+            </w:pPr>
+            <w:r>
+              <w:rPr>
+                <w:sz w:val="16"/>
+              </w:rPr>
               <w:t xml:space="preserve">The results table and the accuracy chart</w:t>
             </w:r>
           </w:p>
         </w:tc>
       </w:tr>
       <w:tr>
+        <w:trPr>
+          <w:cantSplit/>
+        </w:trPr>
         <w:tc>
           <w:tcPr/>
           <w:p>
             <w:pPr>
               <w:pStyle w:val="Compact"/>
-              <w:jc w:val="left"/>
-            </w:pPr>
-            <w:r>
+              <w:spacing w:after="20" w:before="20"/>
+              <w:jc w:val="left"/>
+            </w:pPr>
+            <w:r>
+              <w:rPr>
+                <w:sz w:val="16"/>
+              </w:rPr>
               <w:t xml:space="preserve">S8</w:t>
             </w:r>
           </w:p>
@@ -2072,9 +2396,13 @@
           <w:p>
             <w:pPr>
               <w:pStyle w:val="Compact"/>
-              <w:jc w:val="left"/>
-            </w:pPr>
-            <w:r>
+              <w:spacing w:after="20" w:before="20"/>
+              <w:jc w:val="left"/>
+            </w:pPr>
+            <w:r>
+              <w:rPr>
+                <w:sz w:val="16"/>
+              </w:rPr>
               <w:t xml:space="preserve">3a. Side-by-side</w:t>
             </w:r>
           </w:p>
@@ -2084,23 +2412,34 @@
           <w:p>
             <w:pPr>
               <w:pStyle w:val="Compact"/>
-              <w:jc w:val="left"/>
-            </w:pPr>
-            <w:r>
+              <w:spacing w:after="20" w:before="20"/>
+              <w:jc w:val="left"/>
+            </w:pPr>
+            <w:r>
+              <w:rPr>
+                <w:sz w:val="16"/>
+              </w:rPr>
               <w:t xml:space="preserve">The table of four tokenizers on eight tweets</w:t>
             </w:r>
           </w:p>
         </w:tc>
       </w:tr>
       <w:tr>
+        <w:trPr>
+          <w:cantSplit/>
+        </w:trPr>
         <w:tc>
           <w:tcPr/>
           <w:p>
             <w:pPr>
               <w:pStyle w:val="Compact"/>
-              <w:jc w:val="left"/>
-            </w:pPr>
-            <w:r>
+              <w:spacing w:after="20" w:before="20"/>
+              <w:jc w:val="left"/>
+            </w:pPr>
+            <w:r>
+              <w:rPr>
+                <w:sz w:val="16"/>
+              </w:rPr>
               <w:t xml:space="preserve">S9</w:t>
             </w:r>
           </w:p>
@@ -2110,9 +2449,13 @@
           <w:p>
             <w:pPr>
               <w:pStyle w:val="Compact"/>
-              <w:jc w:val="left"/>
-            </w:pPr>
-            <w:r>
+              <w:spacing w:after="20" w:before="20"/>
+              <w:jc w:val="left"/>
+            </w:pPr>
+            <w:r>
+              <w:rPr>
+                <w:sz w:val="16"/>
+              </w:rPr>
               <w:t xml:space="preserve">3a and 3b</w:t>
             </w:r>
           </w:p>
@@ -2122,23 +2465,34 @@
           <w:p>
             <w:pPr>
               <w:pStyle w:val="Compact"/>
-              <w:jc w:val="left"/>
-            </w:pPr>
-            <w:r>
+              <w:spacing w:after="20" w:before="20"/>
+              <w:jc w:val="left"/>
+            </w:pPr>
+            <w:r>
+              <w:rPr>
+                <w:sz w:val="16"/>
+              </w:rPr>
               <w:t xml:space="preserve">One per-tweet table (class, lexeme, normalized) and the symbol table</w:t>
             </w:r>
           </w:p>
         </w:tc>
       </w:tr>
       <w:tr>
+        <w:trPr>
+          <w:cantSplit/>
+        </w:trPr>
         <w:tc>
           <w:tcPr/>
           <w:p>
             <w:pPr>
               <w:pStyle w:val="Compact"/>
-              <w:jc w:val="left"/>
-            </w:pPr>
-            <w:r>
+              <w:spacing w:after="20" w:before="20"/>
+              <w:jc w:val="left"/>
+            </w:pPr>
+            <w:r>
+              <w:rPr>
+                <w:sz w:val="16"/>
+              </w:rPr>
               <w:t xml:space="preserve">S10</w:t>
             </w:r>
           </w:p>
@@ -2148,9 +2502,13 @@
           <w:p>
             <w:pPr>
               <w:pStyle w:val="Compact"/>
-              <w:jc w:val="left"/>
-            </w:pPr>
-            <w:r>
+              <w:spacing w:after="20" w:before="20"/>
+              <w:jc w:val="left"/>
+            </w:pPr>
+            <w:r>
+              <w:rPr>
+                <w:sz w:val="16"/>
+              </w:rPr>
               <w:t xml:space="preserve">3c. Own DFA engine</w:t>
             </w:r>
           </w:p>
@@ -2160,23 +2518,34 @@
           <w:p>
             <w:pPr>
               <w:pStyle w:val="Compact"/>
-              <w:jc w:val="left"/>
-            </w:pPr>
-            <w:r>
+              <w:spacing w:after="20" w:before="20"/>
+              <w:jc w:val="left"/>
+            </w:pPr>
+            <w:r>
+              <w:rPr>
+                <w:sz w:val="16"/>
+              </w:rPr>
               <w:t xml:space="preserve">The state-count table and the DFA picture</w:t>
             </w:r>
           </w:p>
         </w:tc>
       </w:tr>
       <w:tr>
+        <w:trPr>
+          <w:cantSplit/>
+        </w:trPr>
         <w:tc>
           <w:tcPr/>
           <w:p>
             <w:pPr>
               <w:pStyle w:val="Compact"/>
-              <w:jc w:val="left"/>
-            </w:pPr>
-            <w:r>
+              <w:spacing w:after="20" w:before="20"/>
+              <w:jc w:val="left"/>
+            </w:pPr>
+            <w:r>
+              <w:rPr>
+                <w:sz w:val="16"/>
+              </w:rPr>
               <w:t xml:space="preserve">S11</w:t>
             </w:r>
           </w:p>
@@ -2186,9 +2555,13 @@
           <w:p>
             <w:pPr>
               <w:pStyle w:val="Compact"/>
-              <w:jc w:val="left"/>
-            </w:pPr>
-            <w:r>
+              <w:spacing w:after="20" w:before="20"/>
+              <w:jc w:val="left"/>
+            </w:pPr>
+            <w:r>
+              <w:rPr>
+                <w:sz w:val="16"/>
+              </w:rPr>
               <w:t xml:space="preserve">3d. Scanner demo</w:t>
             </w:r>
           </w:p>
@@ -2198,50 +2571,78 @@
           <w:p>
             <w:pPr>
               <w:pStyle w:val="Compact"/>
-              <w:jc w:val="left"/>
-            </w:pPr>
-            <w:r>
+              <w:spacing w:after="20" w:before="20"/>
+              <w:jc w:val="left"/>
+            </w:pPr>
+            <w:r>
+              <w:rPr>
+                <w:sz w:val="16"/>
+              </w:rPr>
               <w:t xml:space="preserve">The token table (with the</w:t>
             </w:r>
             <w:r>
+              <w:rPr>
+                <w:sz w:val="16"/>
+              </w:rPr>
               <w:t xml:space="preserve"> </w:t>
             </w:r>
             <w:r>
               <w:rPr>
                 <w:rStyle w:val="VerbatimChar"/>
+                <w:sz w:val="16"/>
               </w:rPr>
               <w:t xml:space="preserve">UNKNOWN</w:t>
             </w:r>
             <w:r>
+              <w:rPr>
+                <w:sz w:val="16"/>
+              </w:rPr>
               <w:t xml:space="preserve"> </w:t>
             </w:r>
             <w:r>
+              <w:rPr>
+                <w:sz w:val="16"/>
+              </w:rPr>
               <w:t xml:space="preserve">row for</w:t>
             </w:r>
             <w:r>
+              <w:rPr>
+                <w:sz w:val="16"/>
+              </w:rPr>
               <w:t xml:space="preserve"> </w:t>
             </w:r>
             <w:r>
               <w:rPr>
                 <w:rStyle w:val="VerbatimChar"/>
+                <w:sz w:val="16"/>
               </w:rPr>
               <w:t xml:space="preserve">§</w:t>
             </w:r>
             <w:r>
+              <w:rPr>
+                <w:sz w:val="16"/>
+              </w:rPr>
               <w:t xml:space="preserve">) and the line "DFA scanner and PLY lexer agree on this input: True"</w:t>
             </w:r>
           </w:p>
         </w:tc>
       </w:tr>
       <w:tr>
+        <w:trPr>
+          <w:cantSplit/>
+        </w:trPr>
         <w:tc>
           <w:tcPr/>
           <w:p>
             <w:pPr>
               <w:pStyle w:val="Compact"/>
-              <w:jc w:val="left"/>
-            </w:pPr>
-            <w:r>
+              <w:spacing w:after="20" w:before="20"/>
+              <w:jc w:val="left"/>
+            </w:pPr>
+            <w:r>
+              <w:rPr>
+                <w:sz w:val="16"/>
+              </w:rPr>
               <w:t xml:space="preserve">S12</w:t>
             </w:r>
           </w:p>
@@ -2251,9 +2652,13 @@
           <w:p>
             <w:pPr>
               <w:pStyle w:val="Compact"/>
-              <w:jc w:val="left"/>
-            </w:pPr>
-            <w:r>
+              <w:spacing w:after="20" w:before="20"/>
+              <w:jc w:val="left"/>
+            </w:pPr>
+            <w:r>
+              <w:rPr>
+                <w:sz w:val="16"/>
+              </w:rPr>
               <w:t xml:space="preserve">3e. Intrinsic metrics</w:t>
             </w:r>
           </w:p>
@@ -2263,23 +2668,34 @@
           <w:p>
             <w:pPr>
               <w:pStyle w:val="Compact"/>
-              <w:jc w:val="left"/>
-            </w:pPr>
-            <w:r>
+              <w:spacing w:after="20" w:before="20"/>
+              <w:jc w:val="left"/>
+            </w:pPr>
+            <w:r>
+              <w:rPr>
+                <w:sz w:val="16"/>
+              </w:rPr>
               <w:t xml:space="preserve">The table and the three-panel chart</w:t>
             </w:r>
           </w:p>
         </w:tc>
       </w:tr>
       <w:tr>
+        <w:trPr>
+          <w:cantSplit/>
+        </w:trPr>
         <w:tc>
           <w:tcPr/>
           <w:p>
             <w:pPr>
               <w:pStyle w:val="Compact"/>
-              <w:jc w:val="left"/>
-            </w:pPr>
-            <w:r>
+              <w:spacing w:after="20" w:before="20"/>
+              <w:jc w:val="left"/>
+            </w:pPr>
+            <w:r>
+              <w:rPr>
+                <w:sz w:val="16"/>
+              </w:rPr>
               <w:t xml:space="preserve">S13</w:t>
             </w:r>
           </w:p>
@@ -2289,9 +2705,13 @@
           <w:p>
             <w:pPr>
               <w:pStyle w:val="Compact"/>
-              <w:jc w:val="left"/>
-            </w:pPr>
-            <w:r>
+              <w:spacing w:after="20" w:before="20"/>
+              <w:jc w:val="left"/>
+            </w:pPr>
+            <w:r>
+              <w:rPr>
+                <w:sz w:val="16"/>
+              </w:rPr>
               <w:t xml:space="preserve">4. Existing vs proposed</w:t>
             </w:r>
           </w:p>
@@ -2301,15 +2721,24 @@
           <w:p>
             <w:pPr>
               <w:pStyle w:val="Compact"/>
-              <w:jc w:val="left"/>
-            </w:pPr>
-            <w:r>
+              <w:spacing w:after="20" w:before="20"/>
+              <w:jc w:val="left"/>
+            </w:pPr>
+            <w:r>
+              <w:rPr>
+                <w:sz w:val="16"/>
+              </w:rPr>
               <w:t xml:space="preserve">The table and the two-panel chart</w:t>
             </w:r>
           </w:p>
         </w:tc>
       </w:tr>
     </w:tbl>
+    <w:p>
+      <w:pPr>
+        <w:spacing w:before="0" w:after="60" w:line="120" w:lineRule="exact"/>
+      </w:pPr>
+    </w:p>
     <w:p>
       <w:pPr>
         <w:pStyle w:val="BodyText"/>
@@ -4536,13 +4965,36 @@
       </w:r>
     </w:p>
     <w:bookmarkEnd w:id="50"/>
-    <w:sectPr/>
+    <w:sectPr>
+      <w:footerReference w:type="default" r:id="rId9"/>
+      <w:pgSz w:w="11906" w:h="16838"/>
+      <w:pgMar w:left="1247" w:right="1247" w:top="1247" w:bottom="1247"/>
+    </w:sectPr>
   </w:body>
 </w:document>
 </file>
 
 <file path=word/comments.xml><?xml version="1.0" encoding="utf-8"?>
 <w:comments xmlns:w="http://schemas.openxmlformats.org/wordprocessingml/2006/main" xmlns:m="http://schemas.openxmlformats.org/officeDocument/2006/math" xmlns:r="http://schemas.openxmlformats.org/officeDocument/2006/relationships" xmlns:o="urn:schemas-microsoft-com:office:office" xmlns:v="urn:schemas-microsoft-com:vml" xmlns:w10="urn:schemas-microsoft-com:office:word" xmlns:a="http://schemas.openxmlformats.org/drawingml/2006/main" xmlns:pic="http://schemas.openxmlformats.org/drawingml/2006/picture" xmlns:wp="http://schemas.openxmlformats.org/drawingml/2006/wordprocessingDrawing"/>
+</file>
+
+<file path=word/footer1.xml><?xml version="1.0" encoding="utf-8"?>
+<w:ftr xmlns:m="http://schemas.openxmlformats.org/officeDocument/2006/math" xmlns:mc="http://schemas.openxmlformats.org/markup-compatibility/2006" xmlns:mo="http://schemas.microsoft.com/office/mac/office/2008/main" xmlns:mv="urn:schemas-microsoft-com:mac:vml" xmlns:o="urn:schemas-microsoft-com:office:office" xmlns:r="http://schemas.openxmlformats.org/officeDocument/2006/relationships" xmlns:v="urn:schemas-microsoft-com:vml" xmlns:w10="urn:schemas-microsoft-com:office:word" xmlns:w14="http://schemas.microsoft.com/office/word/2010/wordml" xmlns:w="http://schemas.openxmlformats.org/wordprocessingml/2006/main" xmlns:wne="http://schemas.microsoft.com/office/word/2006/wordml" xmlns:wp14="http://schemas.microsoft.com/office/word/2010/wordprocessingDrawing" xmlns:wp="http://schemas.openxmlformats.org/drawingml/2006/wordprocessingDrawing" xmlns:wpc="http://schemas.microsoft.com/office/word/2010/wordprocessingCanvas" xmlns:wpg="http://schemas.microsoft.com/office/word/2010/wordprocessingGroup" xmlns:wpi="http://schemas.microsoft.com/office/word/2010/wordprocessingInk" xmlns:wps="http://schemas.microsoft.com/office/word/2010/wordprocessingShape" mc:Ignorable="w14 wp14">
+  <w:p>
+    <w:pPr>
+      <w:pStyle w:val="Footer"/>
+      <w:jc w:val="center"/>
+    </w:pPr>
+    <w:r>
+      <w:rPr>
+        <w:sz w:val="18"/>
+      </w:rPr>
+      <w:fldChar w:fldCharType="begin"/>
+      <w:instrText xml:space="preserve">PAGE</w:instrText>
+      <w:fldChar w:fldCharType="end"/>
+    </w:r>
+  </w:p>
+</w:ftr>
 </file>
 
 <file path=word/footnotes.xml><?xml version="1.0" encoding="utf-8"?>
@@ -5370,29 +5822,48 @@
   <w:style w:default="1" w:styleId="Normal" w:type="paragraph">
     <w:name w:val="Normal"/>
     <w:qFormat/>
+    <w:rPr>
+      <w:rFonts w:ascii="Times New Roman" w:hAnsi="Times New Roman" w:cs="Times New Roman" w:eastAsia="Times New Roman"/>
+      <w:sz w:val="22"/>
+    </w:rPr>
   </w:style>
   <w:style w:styleId="BodyText" w:type="paragraph">
     <w:name w:val="Body Text"/>
     <w:basedOn w:val="Normal"/>
     <w:link w:val="BodyTextChar"/>
     <w:pPr>
-      <w:spacing w:after="180" w:before="180"/>
+      <w:spacing w:after="120" w:before="0" w:line="259" w:lineRule="auto"/>
     </w:pPr>
     <w:qFormat/>
+    <w:rPr>
+      <w:rFonts w:ascii="Times New Roman" w:hAnsi="Times New Roman" w:cs="Times New Roman" w:eastAsia="Times New Roman"/>
+      <w:sz w:val="22"/>
+    </w:rPr>
   </w:style>
   <w:style w:customStyle="1" w:styleId="FirstParagraph" w:type="paragraph">
     <w:name w:val="First Paragraph"/>
     <w:basedOn w:val="BodyText"/>
     <w:next w:val="BodyText"/>
     <w:qFormat/>
+    <w:pPr>
+      <w:spacing w:before="0" w:after="120" w:line="259" w:lineRule="auto"/>
+    </w:pPr>
+    <w:rPr>
+      <w:rFonts w:ascii="Times New Roman" w:hAnsi="Times New Roman" w:cs="Times New Roman" w:eastAsia="Times New Roman"/>
+      <w:sz w:val="22"/>
+    </w:rPr>
   </w:style>
   <w:style w:customStyle="1" w:styleId="Compact" w:type="paragraph">
     <w:name w:val="Compact"/>
     <w:basedOn w:val="BodyText"/>
     <w:qFormat/>
     <w:pPr>
-      <w:spacing w:after="36" w:before="36"/>
+      <w:spacing w:after="40" w:before="0" w:line="259" w:lineRule="auto"/>
     </w:pPr>
+    <w:rPr>
+      <w:rFonts w:ascii="Times New Roman" w:hAnsi="Times New Roman" w:cs="Times New Roman" w:eastAsia="Times New Roman"/>
+      <w:sz w:val="22"/>
+    </w:rPr>
   </w:style>
   <w:style w:styleId="Title" w:type="paragraph">
     <w:name w:val="Title"/>
@@ -5406,11 +5877,11 @@
       <w:jc w:val="center"/>
     </w:pPr>
     <w:rPr>
-      <w:rFonts w:asciiTheme="majorHAnsi" w:cstheme="majorBidi" w:eastAsiaTheme="majorEastAsia" w:hAnsiTheme="majorHAnsi"/>
+      <w:rFonts w:ascii="Times New Roman" w:hAnsi="Times New Roman" w:cs="Times New Roman" w:eastAsia="Times New Roman"/>
       <w:b/>
       <w:bCs/>
-      <w:color w:themeColor="accent1" w:themeShade="B5" w:val="345A8A"/>
-      <w:sz w:val="36"/>
+      <w:color w:val="000000"/>
+      <w:sz w:val="40"/>
       <w:szCs w:val="36"/>
     </w:rPr>
   </w:style>
@@ -5426,7 +5897,10 @@
       <w:jc w:val="center"/>
     </w:pPr>
     <w:rPr>
-      <w:sz w:val="30"/>
+      <w:rFonts w:ascii="Times New Roman" w:hAnsi="Times New Roman" w:cs="Times New Roman" w:eastAsia="Times New Roman"/>
+      <w:i/>
+      <w:color w:val="000000"/>
+      <w:sz w:val="24"/>
       <w:szCs w:val="30"/>
     </w:rPr>
   </w:style>
@@ -5439,6 +5913,12 @@
       <w:keepLines/>
       <w:jc w:val="center"/>
     </w:pPr>
+    <w:rPr>
+      <w:rFonts w:ascii="Times New Roman" w:hAnsi="Times New Roman" w:cs="Times New Roman" w:eastAsia="Times New Roman"/>
+      <w:i w:val="0"/>
+      <w:color w:val="000000"/>
+      <w:sz w:val="23"/>
+    </w:rPr>
   </w:style>
   <w:style w:styleId="Date" w:type="paragraph">
     <w:name w:val="Date"/>
@@ -5449,6 +5929,12 @@
       <w:keepLines/>
       <w:jc w:val="center"/>
     </w:pPr>
+    <w:rPr>
+      <w:rFonts w:ascii="Times New Roman" w:hAnsi="Times New Roman" w:cs="Times New Roman" w:eastAsia="Times New Roman"/>
+      <w:i w:val="0"/>
+      <w:color w:val="000000"/>
+      <w:sz w:val="21"/>
+    </w:rPr>
   </w:style>
   <w:style w:customStyle="1" w:styleId="AbstractTitle" w:type="paragraph">
     <w:name w:val="Abstract Title"/>
@@ -5501,15 +5987,16 @@
     <w:pPr>
       <w:keepNext/>
       <w:keepLines/>
-      <w:spacing w:after="0" w:before="480"/>
+      <w:spacing w:after="80" w:before="280"/>
       <w:outlineLvl w:val="0"/>
     </w:pPr>
     <w:rPr>
-      <w:rFonts w:asciiTheme="majorHAnsi" w:cstheme="majorBidi" w:eastAsiaTheme="majorEastAsia" w:hAnsiTheme="majorHAnsi"/>
+      <w:rFonts w:ascii="Times New Roman" w:hAnsi="Times New Roman" w:cs="Times New Roman" w:eastAsia="Times New Roman"/>
       <w:b/>
       <w:bCs/>
-      <w:color w:themeColor="accent1" w:val="4F81BD"/>
-      <w:sz w:val="32"/>
+      <w:i w:val="0"/>
+      <w:color w:val="000000"/>
+      <w:sz w:val="30"/>
       <w:szCs w:val="32"/>
     </w:rPr>
   </w:style>
@@ -5523,15 +6010,16 @@
     <w:pPr>
       <w:keepNext/>
       <w:keepLines/>
-      <w:spacing w:after="0" w:before="200"/>
+      <w:spacing w:after="80" w:before="200"/>
       <w:outlineLvl w:val="1"/>
     </w:pPr>
     <w:rPr>
-      <w:rFonts w:asciiTheme="majorHAnsi" w:cstheme="majorBidi" w:eastAsiaTheme="majorEastAsia" w:hAnsiTheme="majorHAnsi"/>
+      <w:rFonts w:ascii="Times New Roman" w:hAnsi="Times New Roman" w:cs="Times New Roman" w:eastAsia="Times New Roman"/>
       <w:b/>
       <w:bCs/>
-      <w:color w:themeColor="accent1" w:val="4F81BD"/>
-      <w:sz w:val="28"/>
+      <w:i w:val="0"/>
+      <w:color w:val="000000"/>
+      <w:sz w:val="26"/>
       <w:szCs w:val="28"/>
     </w:rPr>
   </w:style>
@@ -5545,15 +6033,16 @@
     <w:pPr>
       <w:keepNext/>
       <w:keepLines/>
-      <w:spacing w:after="0" w:before="200"/>
+      <w:spacing w:after="80" w:before="200"/>
       <w:outlineLvl w:val="2"/>
     </w:pPr>
     <w:rPr>
-      <w:rFonts w:asciiTheme="majorHAnsi" w:cstheme="majorBidi" w:eastAsiaTheme="majorEastAsia" w:hAnsiTheme="majorHAnsi"/>
+      <w:rFonts w:ascii="Times New Roman" w:hAnsi="Times New Roman" w:cs="Times New Roman" w:eastAsia="Times New Roman"/>
       <w:b/>
       <w:bCs/>
-      <w:color w:themeColor="accent1" w:val="4F81BD"/>
-      <w:sz w:val="24"/>
+      <w:i w:val="0"/>
+      <w:color w:val="000000"/>
+      <w:sz w:val="23"/>
       <w:szCs w:val="24"/>
     </w:rPr>
   </w:style>
@@ -5688,9 +6177,13 @@
     <w:unhideWhenUsed/>
     <w:qFormat/>
     <w:pPr>
-      <w:spacing w:after="100" w:before="100"/>
+      <w:spacing w:after="120" w:before="0" w:line="259" w:lineRule="auto"/>
       <w:ind w:firstLine="0" w:left="480" w:right="480"/>
     </w:pPr>
+    <w:rPr>
+      <w:rFonts w:ascii="Times New Roman" w:hAnsi="Times New Roman" w:cs="Times New Roman" w:eastAsia="Times New Roman"/>
+      <w:sz w:val="22"/>
+    </w:rPr>
   </w:style>
   <w:style w:styleId="FootnoteText" w:type="paragraph">
     <w:name w:val="Footnote Text"/>
@@ -5758,10 +6251,14 @@
     <w:basedOn w:val="Normal"/>
     <w:link w:val="BodyTextChar"/>
     <w:pPr>
-      <w:spacing w:after="120" w:before="0"/>
+      <w:spacing w:after="160" w:before="60"/>
     </w:pPr>
     <w:rPr>
-      <w:i/>
+      <w:rFonts w:ascii="Times New Roman" w:hAnsi="Times New Roman" w:cs="Times New Roman" w:eastAsia="Times New Roman"/>
+      <w:b w:val="0"/>
+      <w:i w:val="0"/>
+      <w:color w:val="000000"/>
+      <w:sz w:val="19"/>
     </w:rPr>
   </w:style>
   <w:style w:customStyle="1" w:styleId="TableCaption" w:type="paragraph">
@@ -5769,11 +6266,29 @@
     <w:basedOn w:val="Caption"/>
     <w:pPr>
       <w:keepNext/>
+      <w:spacing w:before="60" w:after="60"/>
     </w:pPr>
+    <w:rPr>
+      <w:rFonts w:ascii="Times New Roman" w:hAnsi="Times New Roman" w:cs="Times New Roman" w:eastAsia="Times New Roman"/>
+      <w:b w:val="0"/>
+      <w:i w:val="0"/>
+      <w:color w:val="000000"/>
+      <w:sz w:val="19"/>
+    </w:rPr>
   </w:style>
   <w:style w:customStyle="1" w:styleId="ImageCaption" w:type="paragraph">
     <w:name w:val="Image Caption"/>
     <w:basedOn w:val="Caption"/>
+    <w:pPr>
+      <w:spacing w:before="60" w:after="160"/>
+    </w:pPr>
+    <w:rPr>
+      <w:rFonts w:ascii="Times New Roman" w:hAnsi="Times New Roman" w:cs="Times New Roman" w:eastAsia="Times New Roman"/>
+      <w:b w:val="0"/>
+      <w:i w:val="0"/>
+      <w:color w:val="000000"/>
+      <w:sz w:val="19"/>
+    </w:rPr>
   </w:style>
   <w:style w:customStyle="1" w:styleId="Figure" w:type="paragraph">
     <w:name w:val="Figure"/>
@@ -5795,8 +6310,8 @@
     <w:name w:val="Verbatim Char"/>
     <w:basedOn w:val="BodyTextChar"/>
     <w:rPr>
-      <w:rFonts w:ascii="Consolas" w:hAnsi="Consolas"/>
-      <w:sz w:val="22"/>
+      <w:rFonts w:ascii="Courier New" w:hAnsi="Courier New" w:cs="Courier New" w:eastAsia="Courier New"/>
+      <w:sz w:val="18"/>
     </w:rPr>
   </w:style>
   <w:style w:customStyle="1" w:styleId="SectionNumber" w:type="character">
@@ -5841,7 +6356,12 @@
     <w:link w:val="VerbatimChar"/>
     <w:pPr>
       <w:wordWrap w:val="off"/>
+      <w:spacing w:before="0" w:after="0"/>
     </w:pPr>
+    <w:rPr>
+      <w:rFonts w:ascii="Courier New" w:hAnsi="Courier New" w:cs="Courier New" w:eastAsia="Courier New"/>
+      <w:sz w:val="16"/>
+    </w:rPr>
   </w:style>
   <w:style w:type="character" w:customStyle="1" w:styleId="KeywordTok">
     <w:name w:val="KeywordTok"/>

</xml_diff>